<commit_message>
fix: corrige estrutura do CT-024 mobile e alinha documentação ao retorno da revisão
</commit_message>
<xml_diff>
--- a/docs/TCC-EBAC-QE-Guilherme-de-Almeida-Santos.docx
+++ b/docs/TCC-EBAC-QE-Guilherme-de-Almeida-Santos.docx
@@ -2394,8 +2394,7 @@
     <w:tbl>
       <w:tblPr>
         <w:tblW w:type="auto" w:w="0"/>
-        <w:tblLayout w:type="fixed"/>
-        <w:tblLook w:firstColumn="1" w:firstRow="1" w:lastColumn="0" w:lastRow="0" w:noHBand="0" w:noVBand="1" w:val="04A0"/>
+        <w:jc w:val="center"/>
         <w:tblBorders>
           <w:top w:val="single" w:sz="4" w:space="0" w:color="808080"/>
           <w:left w:val="single" w:sz="4" w:space="0" w:color="808080"/>
@@ -2404,13 +2403,14 @@
           <w:insideH w:val="single" w:sz="4" w:space="0" w:color="808080"/>
           <w:insideV w:val="single" w:sz="4" w:space="0" w:color="808080"/>
         </w:tblBorders>
+        <w:tblLayout w:type="fixed"/>
         <w:tblCellMar>
           <w:top w:w="40" w:type="dxa"/>
           <w:left w:w="80" w:type="dxa"/>
           <w:bottom w:w="40" w:type="dxa"/>
           <w:right w:w="80" w:type="dxa"/>
         </w:tblCellMar>
-        <w:jc w:val="center"/>
+        <w:tblLook w:firstColumn="1" w:firstRow="1" w:lastColumn="0" w:lastRow="0" w:noHBand="0" w:noVBand="1" w:val="04A0"/>
       </w:tblPr>
       <w:tblGrid>
         <w:gridCol w:w="1360"/>
@@ -13531,8 +13531,7 @@
     <w:tbl>
       <w:tblPr>
         <w:tblW w:type="auto" w:w="0"/>
-        <w:tblLayout w:type="fixed"/>
-        <w:tblLook w:firstColumn="1" w:firstRow="1" w:lastColumn="0" w:lastRow="0" w:noHBand="0" w:noVBand="1" w:val="04A0"/>
+        <w:jc w:val="center"/>
         <w:tblBorders>
           <w:top w:val="single" w:sz="4" w:space="0" w:color="808080"/>
           <w:left w:val="single" w:sz="4" w:space="0" w:color="808080"/>
@@ -13541,13 +13540,14 @@
           <w:insideH w:val="single" w:sz="4" w:space="0" w:color="808080"/>
           <w:insideV w:val="single" w:sz="4" w:space="0" w:color="808080"/>
         </w:tblBorders>
+        <w:tblLayout w:type="fixed"/>
         <w:tblCellMar>
           <w:top w:w="40" w:type="dxa"/>
           <w:left w:w="80" w:type="dxa"/>
           <w:bottom w:w="40" w:type="dxa"/>
           <w:right w:w="80" w:type="dxa"/>
         </w:tblCellMar>
-        <w:jc w:val="center"/>
+        <w:tblLook w:firstColumn="1" w:firstRow="1" w:lastColumn="0" w:lastRow="0" w:noHBand="0" w:noVBand="1" w:val="04A0"/>
       </w:tblPr>
       <w:tblGrid>
         <w:gridCol w:w="3685"/>
@@ -14808,8 +14808,7 @@
     <w:tbl>
       <w:tblPr>
         <w:tblW w:type="auto" w:w="0"/>
-        <w:tblLayout w:type="fixed"/>
-        <w:tblLook w:firstColumn="1" w:firstRow="1" w:lastColumn="0" w:lastRow="0" w:noHBand="0" w:noVBand="1" w:val="04A0"/>
+        <w:jc w:val="center"/>
         <w:tblBorders>
           <w:top w:val="single" w:sz="4" w:space="0" w:color="808080"/>
           <w:left w:val="single" w:sz="4" w:space="0" w:color="808080"/>
@@ -14818,13 +14817,14 @@
           <w:insideH w:val="single" w:sz="4" w:space="0" w:color="808080"/>
           <w:insideV w:val="single" w:sz="4" w:space="0" w:color="808080"/>
         </w:tblBorders>
+        <w:tblLayout w:type="fixed"/>
         <w:tblCellMar>
           <w:top w:w="40" w:type="dxa"/>
           <w:left w:w="80" w:type="dxa"/>
           <w:bottom w:w="40" w:type="dxa"/>
           <w:right w:w="80" w:type="dxa"/>
         </w:tblCellMar>
-        <w:jc w:val="center"/>
+        <w:tblLook w:firstColumn="1" w:firstRow="1" w:lastColumn="0" w:lastRow="0" w:noHBand="0" w:noVBand="1" w:val="04A0"/>
       </w:tblPr>
       <w:tblGrid>
         <w:gridCol w:w="907"/>
@@ -14963,9 +14963,6 @@
             <w:pPr>
               <w:spacing w:before="0" w:after="0" w:line="240" w:lineRule="auto"/>
             </w:pPr>
-            <w:pPr>
-              <w:spacing w:before="0" w:after="0" w:line="240" w:lineRule="auto"/>
-            </w:pPr>
             <w:r>
               <w:rPr>
                 <w:rFonts w:ascii="Arial" w:eastAsia="Arial" w:hAnsi="Arial" w:cs="Arial"/>
@@ -15594,9 +15591,6 @@
             <w:pPr>
               <w:spacing w:before="0" w:after="0" w:line="240" w:lineRule="auto"/>
             </w:pPr>
-            <w:pPr>
-              <w:spacing w:before="0" w:after="0" w:line="240" w:lineRule="auto"/>
-            </w:pPr>
             <w:r>
               <w:rPr>
                 <w:rFonts w:ascii="Arial" w:eastAsia="Arial" w:hAnsi="Arial" w:cs="Arial"/>
@@ -16325,9 +16319,6 @@
             <w:pPr>
               <w:spacing w:before="0" w:after="0" w:line="240" w:lineRule="auto"/>
             </w:pPr>
-            <w:pPr>
-              <w:spacing w:before="0" w:after="0" w:line="240" w:lineRule="auto"/>
-            </w:pPr>
             <w:r>
               <w:rPr>
                 <w:rFonts w:ascii="Arial" w:eastAsia="Arial" w:hAnsi="Arial" w:cs="Arial"/>
@@ -17256,9 +17247,6 @@
             <w:pPr>
               <w:spacing w:before="0" w:after="0" w:line="240" w:lineRule="auto"/>
             </w:pPr>
-            <w:pPr>
-              <w:spacing w:before="0" w:after="0" w:line="240" w:lineRule="auto"/>
-            </w:pPr>
             <w:r>
               <w:rPr>
                 <w:rFonts w:ascii="Arial" w:eastAsia="Arial" w:hAnsi="Arial" w:cs="Arial"/>
@@ -17987,9 +17975,6 @@
             <w:pPr>
               <w:spacing w:before="0" w:after="0" w:line="240" w:lineRule="auto"/>
             </w:pPr>
-            <w:pPr>
-              <w:spacing w:before="0" w:after="0" w:line="240" w:lineRule="auto"/>
-            </w:pPr>
             <w:r>
               <w:rPr>
                 <w:rFonts w:ascii="Arial" w:eastAsia="Arial" w:hAnsi="Arial" w:cs="Arial"/>
@@ -18418,9 +18403,6 @@
             <w:pPr>
               <w:spacing w:before="0" w:after="0" w:line="240" w:lineRule="auto"/>
             </w:pPr>
-            <w:pPr>
-              <w:spacing w:before="0" w:after="0" w:line="240" w:lineRule="auto"/>
-            </w:pPr>
             <w:r>
               <w:rPr>
                 <w:rFonts w:ascii="Arial" w:eastAsia="Arial" w:hAnsi="Arial" w:cs="Arial"/>
@@ -18849,9 +18831,6 @@
             <w:pPr>
               <w:spacing w:before="0" w:after="0" w:line="240" w:lineRule="auto"/>
             </w:pPr>
-            <w:pPr>
-              <w:spacing w:before="0" w:after="0" w:line="240" w:lineRule="auto"/>
-            </w:pPr>
             <w:r>
               <w:rPr>
                 <w:rFonts w:ascii="Arial" w:eastAsia="Arial" w:hAnsi="Arial" w:cs="Arial"/>
@@ -19280,9 +19259,6 @@
             <w:pPr>
               <w:spacing w:before="0" w:after="0" w:line="240" w:lineRule="auto"/>
             </w:pPr>
-            <w:pPr>
-              <w:spacing w:before="0" w:after="0" w:line="240" w:lineRule="auto"/>
-            </w:pPr>
             <w:r>
               <w:rPr>
                 <w:rFonts w:ascii="Arial" w:eastAsia="Arial" w:hAnsi="Arial" w:cs="Arial"/>
@@ -19743,8 +19719,7 @@
     <w:tbl>
       <w:tblPr>
         <w:tblW w:type="auto" w:w="0"/>
-        <w:tblLayout w:type="fixed"/>
-        <w:tblLook w:firstColumn="1" w:firstRow="1" w:lastColumn="0" w:lastRow="0" w:noHBand="0" w:noVBand="1" w:val="04A0"/>
+        <w:jc w:val="center"/>
         <w:tblBorders>
           <w:top w:val="single" w:sz="4" w:space="0" w:color="808080"/>
           <w:left w:val="single" w:sz="4" w:space="0" w:color="808080"/>
@@ -19753,13 +19728,14 @@
           <w:insideH w:val="single" w:sz="4" w:space="0" w:color="808080"/>
           <w:insideV w:val="single" w:sz="4" w:space="0" w:color="808080"/>
         </w:tblBorders>
+        <w:tblLayout w:type="fixed"/>
         <w:tblCellMar>
           <w:top w:w="40" w:type="dxa"/>
           <w:left w:w="80" w:type="dxa"/>
           <w:bottom w:w="40" w:type="dxa"/>
           <w:right w:w="80" w:type="dxa"/>
         </w:tblCellMar>
-        <w:jc w:val="center"/>
+        <w:tblLook w:firstColumn="1" w:firstRow="1" w:lastColumn="0" w:lastRow="0" w:noHBand="0" w:noVBand="1" w:val="04A0"/>
       </w:tblPr>
       <w:tblGrid>
         <w:gridCol w:w="2835"/>
@@ -20966,8 +20942,7 @@
     <w:tbl>
       <w:tblPr>
         <w:tblW w:type="auto" w:w="0"/>
-        <w:tblLayout w:type="fixed"/>
-        <w:tblLook w:firstColumn="1" w:firstRow="1" w:lastColumn="0" w:lastRow="0" w:noHBand="0" w:noVBand="1" w:val="04A0"/>
+        <w:jc w:val="center"/>
         <w:tblBorders>
           <w:top w:val="single" w:sz="4" w:space="0" w:color="808080"/>
           <w:left w:val="single" w:sz="4" w:space="0" w:color="808080"/>
@@ -20976,13 +20951,14 @@
           <w:insideH w:val="single" w:sz="4" w:space="0" w:color="808080"/>
           <w:insideV w:val="single" w:sz="4" w:space="0" w:color="808080"/>
         </w:tblBorders>
+        <w:tblLayout w:type="fixed"/>
         <w:tblCellMar>
           <w:top w:w="40" w:type="dxa"/>
           <w:left w:w="80" w:type="dxa"/>
           <w:bottom w:w="40" w:type="dxa"/>
           <w:right w:w="80" w:type="dxa"/>
         </w:tblCellMar>
-        <w:jc w:val="center"/>
+        <w:tblLook w:firstColumn="1" w:firstRow="1" w:lastColumn="0" w:lastRow="0" w:noHBand="0" w:noVBand="1" w:val="04A0"/>
       </w:tblPr>
       <w:tblGrid>
         <w:gridCol w:w="2041"/>
@@ -21838,8 +21814,7 @@
     <w:tbl>
       <w:tblPr>
         <w:tblW w:type="auto" w:w="0"/>
-        <w:tblLayout w:type="fixed"/>
-        <w:tblLook w:firstColumn="1" w:firstRow="1" w:lastColumn="0" w:lastRow="0" w:noHBand="0" w:noVBand="1" w:val="04A0"/>
+        <w:jc w:val="center"/>
         <w:tblBorders>
           <w:top w:val="single" w:sz="4" w:space="0" w:color="808080"/>
           <w:left w:val="single" w:sz="4" w:space="0" w:color="808080"/>
@@ -21848,13 +21823,14 @@
           <w:insideH w:val="single" w:sz="4" w:space="0" w:color="808080"/>
           <w:insideV w:val="single" w:sz="4" w:space="0" w:color="808080"/>
         </w:tblBorders>
+        <w:tblLayout w:type="fixed"/>
         <w:tblCellMar>
           <w:top w:w="40" w:type="dxa"/>
           <w:left w:w="80" w:type="dxa"/>
           <w:bottom w:w="40" w:type="dxa"/>
           <w:right w:w="80" w:type="dxa"/>
         </w:tblCellMar>
-        <w:jc w:val="center"/>
+        <w:tblLook w:firstColumn="1" w:firstRow="1" w:lastColumn="0" w:lastRow="0" w:noHBand="0" w:noVBand="1" w:val="04A0"/>
       </w:tblPr>
       <w:tblGrid>
         <w:gridCol w:w="2381"/>
@@ -23976,8 +23952,7 @@
     <w:tbl>
       <w:tblPr>
         <w:tblW w:type="auto" w:w="0"/>
-        <w:tblLayout w:type="fixed"/>
-        <w:tblLook w:firstColumn="1" w:firstRow="1" w:lastColumn="0" w:lastRow="0" w:noHBand="0" w:noVBand="1" w:val="04A0"/>
+        <w:jc w:val="center"/>
         <w:tblBorders>
           <w:top w:val="single" w:sz="4" w:space="0" w:color="808080"/>
           <w:left w:val="single" w:sz="4" w:space="0" w:color="808080"/>
@@ -23986,13 +23961,14 @@
           <w:insideH w:val="single" w:sz="4" w:space="0" w:color="808080"/>
           <w:insideV w:val="single" w:sz="4" w:space="0" w:color="808080"/>
         </w:tblBorders>
+        <w:tblLayout w:type="fixed"/>
         <w:tblCellMar>
           <w:top w:w="40" w:type="dxa"/>
           <w:left w:w="80" w:type="dxa"/>
           <w:bottom w:w="40" w:type="dxa"/>
           <w:right w:w="80" w:type="dxa"/>
         </w:tblCellMar>
-        <w:jc w:val="center"/>
+        <w:tblLook w:firstColumn="1" w:firstRow="1" w:lastColumn="0" w:lastRow="0" w:noHBand="0" w:noVBand="1" w:val="04A0"/>
       </w:tblPr>
       <w:tblGrid>
         <w:gridCol w:w="1077"/>
@@ -24629,8 +24605,7 @@
     <w:tbl>
       <w:tblPr>
         <w:tblW w:type="auto" w:w="0"/>
-        <w:tblLayout w:type="fixed"/>
-        <w:tblLook w:firstColumn="1" w:firstRow="1" w:lastColumn="0" w:lastRow="0" w:noHBand="0" w:noVBand="1" w:val="04A0"/>
+        <w:jc w:val="center"/>
         <w:tblBorders>
           <w:top w:val="single" w:sz="4" w:space="0" w:color="808080"/>
           <w:left w:val="single" w:sz="4" w:space="0" w:color="808080"/>
@@ -24639,13 +24614,14 @@
           <w:insideH w:val="single" w:sz="4" w:space="0" w:color="808080"/>
           <w:insideV w:val="single" w:sz="4" w:space="0" w:color="808080"/>
         </w:tblBorders>
+        <w:tblLayout w:type="fixed"/>
         <w:tblCellMar>
           <w:top w:w="40" w:type="dxa"/>
           <w:left w:w="80" w:type="dxa"/>
           <w:bottom w:w="40" w:type="dxa"/>
           <w:right w:w="80" w:type="dxa"/>
         </w:tblCellMar>
-        <w:jc w:val="center"/>
+        <w:tblLook w:firstColumn="1" w:firstRow="1" w:lastColumn="0" w:lastRow="0" w:noHBand="0" w:noVBand="1" w:val="04A0"/>
       </w:tblPr>
       <w:tblGrid>
         <w:gridCol w:w="1701"/>
@@ -25287,8 +25263,7 @@
     <w:tbl>
       <w:tblPr>
         <w:tblW w:type="auto" w:w="0"/>
-        <w:tblLayout w:type="fixed"/>
-        <w:tblLook w:firstColumn="1" w:firstRow="1" w:lastColumn="0" w:lastRow="0" w:noHBand="0" w:noVBand="1" w:val="04A0"/>
+        <w:jc w:val="center"/>
         <w:tblBorders>
           <w:top w:val="single" w:sz="4" w:space="0" w:color="808080"/>
           <w:left w:val="single" w:sz="4" w:space="0" w:color="808080"/>
@@ -25297,13 +25272,14 @@
           <w:insideH w:val="single" w:sz="4" w:space="0" w:color="808080"/>
           <w:insideV w:val="single" w:sz="4" w:space="0" w:color="808080"/>
         </w:tblBorders>
+        <w:tblLayout w:type="fixed"/>
         <w:tblCellMar>
           <w:top w:w="40" w:type="dxa"/>
           <w:left w:w="80" w:type="dxa"/>
           <w:bottom w:w="40" w:type="dxa"/>
           <w:right w:w="80" w:type="dxa"/>
         </w:tblCellMar>
-        <w:jc w:val="center"/>
+        <w:tblLook w:firstColumn="1" w:firstRow="1" w:lastColumn="0" w:lastRow="0" w:noHBand="0" w:noVBand="1" w:val="04A0"/>
       </w:tblPr>
       <w:tblGrid>
         <w:gridCol w:w="2835"/>
@@ -25794,8 +25770,7 @@
     <w:tbl>
       <w:tblPr>
         <w:tblW w:type="auto" w:w="0"/>
-        <w:tblLayout w:type="fixed"/>
-        <w:tblLook w:firstColumn="1" w:firstRow="1" w:lastColumn="0" w:lastRow="0" w:noHBand="0" w:noVBand="1" w:val="04A0"/>
+        <w:jc w:val="center"/>
         <w:tblBorders>
           <w:top w:val="single" w:sz="4" w:space="0" w:color="808080"/>
           <w:left w:val="single" w:sz="4" w:space="0" w:color="808080"/>
@@ -25804,13 +25779,14 @@
           <w:insideH w:val="single" w:sz="4" w:space="0" w:color="808080"/>
           <w:insideV w:val="single" w:sz="4" w:space="0" w:color="808080"/>
         </w:tblBorders>
+        <w:tblLayout w:type="fixed"/>
         <w:tblCellMar>
           <w:top w:w="40" w:type="dxa"/>
           <w:left w:w="80" w:type="dxa"/>
           <w:bottom w:w="40" w:type="dxa"/>
           <w:right w:w="80" w:type="dxa"/>
         </w:tblCellMar>
-        <w:jc w:val="center"/>
+        <w:tblLook w:firstColumn="1" w:firstRow="1" w:lastColumn="0" w:lastRow="0" w:noHBand="0" w:noVBand="1" w:val="04A0"/>
       </w:tblPr>
       <w:tblGrid>
         <w:gridCol w:w="2948"/>

</xml_diff>